<commit_message>
chore(docs): format dissertation abstract as A5 booklet (folded A4)
</commit_message>
<xml_diff>
--- a/Глухов_автореферат.docx
+++ b/Глухов_автореферат.docx
@@ -1695,8 +1695,8 @@
       </w:r>
     </w:p>
     <w:sectPr>
-      <w:pgSz w:w="11906" w:h="16838"/>
-      <w:pgMar w:top="1134" w:right="850" w:bottom="1134" w:left="1701" w:header="708" w:footer="708" w:gutter="0"/>
+      <w:pgSz w:w="16838" w:h="11906" w:orient="landscape"/>
+      <w:pgMar w:top="1021" w:right="851" w:bottom="1021" w:left="1134" w:header="567" w:footer="567" w:gutter="0"/>
     </w:sectPr>
   </w:body>
 </w:document>

</xml_diff>

<commit_message>
refactor(diss-abstract): revise conclusion to address structural and content issues
</commit_message>
<xml_diff>
--- a/Глухов_автореферат.docx
+++ b/Глухов_автореферат.docx
@@ -1443,7 +1443,167 @@
           <w:sz w:val="28"/>
           <w:szCs w:val="28"/>
         </w:rPr>
-        <w:t xml:space="preserve">В заключении подведены итоги исследования. Информатизация музеев Республики Татарстан представляла собой длительный и неоднородный, но внутренне связный процесс, в котором сочетались технические нововведения, административные решения и профессиональные инициативы музейного сообщества. Информатизация приобрела многоуровневый характер, охватив электронный учёт, каталогизацию, интеграцию с федеральными ресурсами, публичные интернет-представительства и новые каналы коммуникации с аудиторией. Одновременно зафиксированы устойчивые ограничения: неравномерность ресурсного обеспечения, дефицит кадров, различия в технической оснащённости крупных государственных и малых муниципальных музеев, зависимость части учреждений от внешней методической поддержки. Информатизация музеев Республики Татарстан рассматривается как часть истории региональной культурной политики и музейного дела конца XX — первой четверти XXI века.</w:t>
+        <w:t xml:space="preserve">В заключении подведены итоги исследования, сформулированы основные выводы и намечены перспективы дальнейшей работы. Поставленные во введении задачи решены, что позволило достичь цели исследования — реконструировать историю информатизации музейной сети Республики Татарстан как системного регионального процесса, выявить его этапы, институциональные механизмы, специфику и результаты.</w:t>
+      </w:r>
+    </w:p>
+    <w:p>
+      <w:pPr>
+        <w:spacing w:before="0" w:after="160" w:line="360" w:lineRule="auto"/>
+        <w:ind w:firstLine="708"/>
+        <w:jc w:val="both"/>
+        <w:rPr>
+          <w:rFonts w:ascii="Times New Roman" w:hAnsi="Times New Roman" w:cs="Times New Roman"/>
+          <w:sz w:val="28"/>
+          <w:szCs w:val="28"/>
+        </w:rPr>
+      </w:pPr>
+      <w:r>
+        <w:rPr>
+          <w:rFonts w:ascii="Times New Roman" w:hAnsi="Times New Roman" w:cs="Times New Roman"/>
+          <w:sz w:val="28"/>
+          <w:szCs w:val="28"/>
+        </w:rPr>
+        <w:t xml:space="preserve">Проведённое исследование показывает, что информатизация музеев Республики Татарстан представляет собой системный исторический процесс, логика которого определялась взаимодействием федеральной нормативно-правовой базы, региональной политики информационного развития и инициатив самих музейных учреждений, а не сводилась к сумме разрозненных технических нововведений.</w:t>
+      </w:r>
+    </w:p>
+    <w:p>
+      <w:pPr>
+        <w:spacing w:before="0" w:after="160" w:line="360" w:lineRule="auto"/>
+        <w:ind w:firstLine="708"/>
+        <w:jc w:val="both"/>
+        <w:rPr>
+          <w:rFonts w:ascii="Times New Roman" w:hAnsi="Times New Roman" w:cs="Times New Roman"/>
+          <w:sz w:val="28"/>
+          <w:szCs w:val="28"/>
+        </w:rPr>
+      </w:pPr>
+      <w:r>
+        <w:rPr>
+          <w:rFonts w:ascii="Times New Roman" w:hAnsi="Times New Roman" w:cs="Times New Roman"/>
+          <w:sz w:val="28"/>
+          <w:szCs w:val="28"/>
+        </w:rPr>
+        <w:t xml:space="preserve">Ключевым результатом работы является периодизация процесса, в которой выделены пять этапов: предпосылки и начальная, несистемная компьютеризация (начало 1990-х — 2001 г.); формирование системной инфраструктуры на базе КАМИС и региональной координации (2002–2012 гг.); переход к единому информационному пространству (2013–2016 гг.); углубление интеграции в Государственный каталог Музейного фонда Российской Федерации (2017–2019 гг.); развитие дистанционных форм работы и цифровых коммуникаций (с 2020 г.). Границы этапов установлены по смене нормативных условий, технологической базы и институциональной организации.</w:t>
+      </w:r>
+    </w:p>
+    <w:p>
+      <w:pPr>
+        <w:spacing w:before="0" w:after="160" w:line="360" w:lineRule="auto"/>
+        <w:ind w:firstLine="708"/>
+        <w:jc w:val="both"/>
+        <w:rPr>
+          <w:rFonts w:ascii="Times New Roman" w:hAnsi="Times New Roman" w:cs="Times New Roman"/>
+          <w:sz w:val="28"/>
+          <w:szCs w:val="28"/>
+        </w:rPr>
+      </w:pPr>
+      <w:r>
+        <w:rPr>
+          <w:rFonts w:ascii="Times New Roman" w:hAnsi="Times New Roman" w:cs="Times New Roman"/>
+          <w:sz w:val="28"/>
+          <w:szCs w:val="28"/>
+        </w:rPr>
+        <w:t xml:space="preserve">Установлено, что внедрение системы КАМИС-2000 в Национальном музее Республики Татарстан в 2002 году стало отправной точкой системной информатизации и сформировало модель учёта и научной обработки фондов, впоследствии распространённую на другие учреждения республики. Охарактеризована координирующая роль Центра информационных технологий Республики Татарстан: перевод баз данных муниципальных музеев на централизованный сервер создал условия для консолидации музейной информации на региональном уровне и снизил технологические барьеры для учреждений с ограниченными кадровыми и техническими возможностями.</w:t>
+      </w:r>
+    </w:p>
+    <w:p>
+      <w:pPr>
+        <w:spacing w:before="0" w:after="160" w:line="360" w:lineRule="auto"/>
+        <w:ind w:firstLine="708"/>
+        <w:jc w:val="both"/>
+        <w:rPr>
+          <w:rFonts w:ascii="Times New Roman" w:hAnsi="Times New Roman" w:cs="Times New Roman"/>
+          <w:sz w:val="28"/>
+          <w:szCs w:val="28"/>
+        </w:rPr>
+      </w:pPr>
+      <w:r>
+        <w:rPr>
+          <w:rFonts w:ascii="Times New Roman" w:hAnsi="Times New Roman" w:cs="Times New Roman"/>
+          <w:sz w:val="28"/>
+          <w:szCs w:val="28"/>
+        </w:rPr>
+        <w:t xml:space="preserve">Показано, что создание Объединённого электронного каталога (2014 г.) и запуск портала «Виртуальный музей Республики Татарстан» (2015 г.) обозначили переход от внутримузейной автоматизации к единому региональному информационному пространству, а двуязычная, русско-татарская модель портала была связана с нормами республиканского языкового законодательства и отражает специфику региона. Анализ современного этапа показывает, что пандемия COVID-19 выступила катализатором дистанционных форм работы: она ускорила освоение онлайн-форматов и одновременно выявила как сильные стороны ранее созданной инфраструктуры, так и лакуны в сфере цифрового контента и кадровых компетенций.</w:t>
+      </w:r>
+    </w:p>
+    <w:p>
+      <w:pPr>
+        <w:spacing w:before="0" w:after="160" w:line="360" w:lineRule="auto"/>
+        <w:ind w:firstLine="708"/>
+        <w:jc w:val="both"/>
+        <w:rPr>
+          <w:rFonts w:ascii="Times New Roman" w:hAnsi="Times New Roman" w:cs="Times New Roman"/>
+          <w:sz w:val="28"/>
+          <w:szCs w:val="28"/>
+        </w:rPr>
+      </w:pPr>
+      <w:r>
+        <w:rPr>
+          <w:rFonts w:ascii="Times New Roman" w:hAnsi="Times New Roman" w:cs="Times New Roman"/>
+          <w:sz w:val="28"/>
+          <w:szCs w:val="28"/>
+        </w:rPr>
+        <w:t xml:space="preserve">Совокупность полученных данных позволяет охарактеризовать татарстанскую модель информатизации музеев как сочетание развитой региональной ИТ-инфраструктуры, двуязычной культурной политики и устойчивой межведомственной координации; это сочетание отличает татарстанский опыт от практики ряда других субъектов Российской Федерации.</w:t>
+      </w:r>
+    </w:p>
+    <w:p>
+      <w:pPr>
+        <w:spacing w:before="0" w:after="160" w:line="360" w:lineRule="auto"/>
+        <w:ind w:firstLine="708"/>
+        <w:jc w:val="both"/>
+        <w:rPr>
+          <w:rFonts w:ascii="Times New Roman" w:hAnsi="Times New Roman" w:cs="Times New Roman"/>
+          <w:sz w:val="28"/>
+          <w:szCs w:val="28"/>
+        </w:rPr>
+      </w:pPr>
+      <w:r>
+        <w:rPr>
+          <w:rFonts w:ascii="Times New Roman" w:hAnsi="Times New Roman" w:cs="Times New Roman"/>
+          <w:sz w:val="28"/>
+          <w:szCs w:val="28"/>
+        </w:rPr>
+        <w:t xml:space="preserve">Научный вклад работы состоит в том, что история информатизации музейной сети Республики Татарстан реконструирована как самостоятельный исторический процесс, ранее не являвшийся предметом специального исследования: предложена пятиэтапная периодизация, в научный оборот введён и систематизирован корпус архивных и устно-исторических источников, последовательно разграничены понятия «оцифровка», «информатизация» и «цифровизация» применительно к музейной практике.</w:t>
+      </w:r>
+    </w:p>
+    <w:p>
+      <w:pPr>
+        <w:spacing w:before="0" w:after="160" w:line="360" w:lineRule="auto"/>
+        <w:ind w:firstLine="708"/>
+        <w:jc w:val="both"/>
+        <w:rPr>
+          <w:rFonts w:ascii="Times New Roman" w:hAnsi="Times New Roman" w:cs="Times New Roman"/>
+          <w:sz w:val="28"/>
+          <w:szCs w:val="28"/>
+        </w:rPr>
+      </w:pPr>
+      <w:r>
+        <w:rPr>
+          <w:rFonts w:ascii="Times New Roman" w:hAnsi="Times New Roman" w:cs="Times New Roman"/>
+          <w:sz w:val="28"/>
+          <w:szCs w:val="28"/>
+        </w:rPr>
+        <w:t xml:space="preserve">Вместе с тем исследование фиксирует устойчивые ограничения процесса: неравномерность ресурсного обеспечения, дефицит профильных кадров, различия в технической оснащённости крупных государственных и малых муниципальных музеев, зависимость части учреждений от внешней методической поддержки.</w:t>
+      </w:r>
+    </w:p>
+    <w:p>
+      <w:pPr>
+        <w:spacing w:before="0" w:after="160" w:line="360" w:lineRule="auto"/>
+        <w:ind w:firstLine="708"/>
+        <w:jc w:val="both"/>
+        <w:rPr>
+          <w:rFonts w:ascii="Times New Roman" w:hAnsi="Times New Roman" w:cs="Times New Roman"/>
+          <w:sz w:val="28"/>
+          <w:szCs w:val="28"/>
+        </w:rPr>
+      </w:pPr>
+      <w:r>
+        <w:rPr>
+          <w:rFonts w:ascii="Times New Roman" w:hAnsi="Times New Roman" w:cs="Times New Roman"/>
+          <w:sz w:val="28"/>
+          <w:szCs w:val="28"/>
+        </w:rPr>
+        <w:t xml:space="preserve">Перспективы дальнейшего исследования связаны со сравнительным изучением информатизации музеев на материале других субъектов Российской Федерации, с анализом влияния цифровых практик на научную и экспозиционную деятельность музеев, а также с осмыслением новых технологий представления культурного наследия. История информатизации музеев Республики Татарстан рассматривается в работе как часть истории региональной культурной политики и музейного дела конца XX — первой четверти XXI века.</w:t>
       </w:r>
     </w:p>
     <w:p>

</xml_diff>